<commit_message>
Update CV with new publication and skills
</commit_message>
<xml_diff>
--- a/cv.docx
+++ b/cv.docx
@@ -96,7 +96,7 @@
         <w:t>AI &amp; Platform:</w:t>
       </w:r>
       <w:r>
-        <w:t xml:space="preserve"> Local LLMs, AI Quality Gates, Prompt Injection Defense (OWASP LLM), Google Cloud Model Armor, Vertex AI. </w:t>
+        <w:t xml:space="preserve"> AI Agents, Automated Security Reviews, Local LLMs, AI Quality Gates, Prompt Injection Defense (OWASP LLM), Google Cloud Model Armor, Vertex AI. </w:t>
       </w:r>
       <w:r>
         <w:rPr>
@@ -137,7 +137,7 @@
             <w:color w:val="0563C1"/>
             <w:u w:val="single"/>
           </w:rPr>
-          <w:t>Antigravity: My approach to deliver the most assured value for the least money</w:t>
+          <w:t>Morning Security Report with Antigravity Agent</w:t>
         </w:r>
       </w:hyperlink>
     </w:p>
@@ -151,7 +151,7 @@
             <w:color w:val="0563C1"/>
             <w:u w:val="single"/>
           </w:rPr>
-          <w:t>How to build a custom AI quality gate on Cloud Run from zero to production</w:t>
+          <w:t>Antigravity: My approach to deliver the most assured value for the least money</w:t>
         </w:r>
       </w:hyperlink>
     </w:p>
@@ -165,6 +165,20 @@
             <w:color w:val="0563C1"/>
             <w:u w:val="single"/>
           </w:rPr>
+          <w:t>How to build a custom AI quality gate on Cloud Run from zero to production</w:t>
+        </w:r>
+      </w:hyperlink>
+    </w:p>
+    <w:p>
+      <w:pPr>
+        <w:pStyle w:val="ListBullet"/>
+      </w:pPr>
+      <w:hyperlink r:id="rId14">
+        <w:r>
+          <w:rPr>
+            <w:color w:val="0563C1"/>
+            <w:u w:val="single"/>
+          </w:rPr>
           <w:t>Architecture Documentation as a First-Class Engineering Asset</w:t>
         </w:r>
       </w:hyperlink>
@@ -173,7 +187,7 @@
       <w:pPr>
         <w:pStyle w:val="ListBullet"/>
       </w:pPr>
-      <w:hyperlink r:id="rId14">
+      <w:hyperlink r:id="rId15">
         <w:r>
           <w:rPr>
             <w:color w:val="0563C1"/>
@@ -901,7 +915,7 @@
       <w:r>
         <w:t xml:space="preserve">Professional Cloud Architect (PCA) — </w:t>
       </w:r>
-      <w:hyperlink r:id="rId15">
+      <w:hyperlink r:id="rId16">
         <w:r>
           <w:rPr>
             <w:color w:val="0563C1"/>
@@ -918,7 +932,7 @@
       <w:r>
         <w:t xml:space="preserve">Professional Cloud Security Engineer (PCSE) — </w:t>
       </w:r>
-      <w:hyperlink r:id="rId16">
+      <w:hyperlink r:id="rId17">
         <w:r>
           <w:rPr>
             <w:color w:val="0563C1"/>
@@ -935,7 +949,7 @@
       <w:r>
         <w:t xml:space="preserve">Professional Cloud Network Engineer (PCNE) — </w:t>
       </w:r>
-      <w:hyperlink r:id="rId17">
+      <w:hyperlink r:id="rId18">
         <w:r>
           <w:rPr>
             <w:color w:val="0563C1"/>
@@ -952,7 +966,7 @@
       <w:r>
         <w:t xml:space="preserve">Generative AI Leader (GAIL) — </w:t>
       </w:r>
-      <w:hyperlink r:id="rId18">
+      <w:hyperlink r:id="rId19">
         <w:r>
           <w:rPr>
             <w:color w:val="0563C1"/>

</xml_diff>